<commit_message>
Deploying to gh-pages from @ Morrison-Lab/psw@dba71b30fcba290e028ed01f8177832ff0bddbe1 🚀
</commit_message>
<xml_diff>
--- a/references.docx
+++ b/references.docx
@@ -15,7 +15,7 @@
         <w:pStyle w:val="Date"/>
       </w:pPr>
       <w:r>
-        <w:t xml:space="preserve">Last modified: 2026-09-26 17:55:08 (UTC)</w:t>
+        <w:t xml:space="preserve">Last modified: 2026-09-29 00:25:56 (UTC)</w:t>
       </w:r>
     </w:p>
     <w:bookmarkStart w:id="10" w:name="references"/>
@@ -88,7 +88,7 @@
         <w:t xml:space="preserve"> </w:t>
       </w:r>
       <w:r>
-        <w:t xml:space="preserve">f45827d</w:t>
+        <w:t xml:space="preserve">dba71b3</w:t>
       </w:r>
     </w:p>
     <w:p>
@@ -110,7 +110,7 @@
         <w:t xml:space="preserve"> </w:t>
       </w:r>
       <w:r>
-        <w:t xml:space="preserve">f45827dfa3d6a45fce16494edc29108910f7ee52</w:t>
+        <w:t xml:space="preserve">dba71b30fcba290e028ed01f8177832ff0bddbe1</w:t>
       </w:r>
     </w:p>
     <w:p>
@@ -132,7 +132,7 @@
         <w:t xml:space="preserve"> </w:t>
       </w:r>
       <w:r>
-        <w:t xml:space="preserve">2026-09-26 10:54:56 -0700</w:t>
+        <w:t xml:space="preserve">2026-09-28 17:25:41 -0700</w:t>
       </w:r>
     </w:p>
     <w:p>

</xml_diff>

<commit_message>
Deploying to gh-pages from @ Morrison-Lab/psw@9e4f94fb4f8c88125aa8b1514b3fe851519efdd0 🚀
</commit_message>
<xml_diff>
--- a/references.docx
+++ b/references.docx
@@ -15,7 +15,7 @@
         <w:pStyle w:val="Date"/>
       </w:pPr>
       <w:r>
-        <w:t xml:space="preserve">Last modified: 2026-09-29 00:25:56 (UTC)</w:t>
+        <w:t xml:space="preserve">Last modified: 2026-09-29 03:17:32 (UTC)</w:t>
       </w:r>
     </w:p>
     <w:bookmarkStart w:id="10" w:name="references"/>
@@ -88,7 +88,7 @@
         <w:t xml:space="preserve"> </w:t>
       </w:r>
       <w:r>
-        <w:t xml:space="preserve">dba71b3</w:t>
+        <w:t xml:space="preserve">9e4f94f</w:t>
       </w:r>
     </w:p>
     <w:p>
@@ -110,7 +110,7 @@
         <w:t xml:space="preserve"> </w:t>
       </w:r>
       <w:r>
-        <w:t xml:space="preserve">dba71b30fcba290e028ed01f8177832ff0bddbe1</w:t>
+        <w:t xml:space="preserve">9e4f94fb4f8c88125aa8b1514b3fe851519efdd0</w:t>
       </w:r>
     </w:p>
     <w:p>
@@ -132,7 +132,7 @@
         <w:t xml:space="preserve"> </w:t>
       </w:r>
       <w:r>
-        <w:t xml:space="preserve">2026-09-28 17:25:41 -0700</w:t>
+        <w:t xml:space="preserve">2026-09-28 20:17:17 -0700</w:t>
       </w:r>
     </w:p>
     <w:p>

</xml_diff>

<commit_message>
Deploying to gh-pages from @ Morrison-Lab/psw@0669706494575783d769da4d61dd7dc7f0b149b4 🚀
</commit_message>
<xml_diff>
--- a/references.docx
+++ b/references.docx
@@ -15,7 +15,7 @@
         <w:pStyle w:val="Date"/>
       </w:pPr>
       <w:r>
-        <w:t xml:space="preserve">Last modified: 2026-09-29 03:17:32 (UTC)</w:t>
+        <w:t xml:space="preserve">Last modified: 2026-09-29 05:56:32 (UTC)</w:t>
       </w:r>
     </w:p>
     <w:bookmarkStart w:id="10" w:name="references"/>
@@ -88,7 +88,7 @@
         <w:t xml:space="preserve"> </w:t>
       </w:r>
       <w:r>
-        <w:t xml:space="preserve">9e4f94f</w:t>
+        <w:t xml:space="preserve">0669706</w:t>
       </w:r>
     </w:p>
     <w:p>
@@ -110,7 +110,7 @@
         <w:t xml:space="preserve"> </w:t>
       </w:r>
       <w:r>
-        <w:t xml:space="preserve">9e4f94fb4f8c88125aa8b1514b3fe851519efdd0</w:t>
+        <w:t xml:space="preserve">0669706494575783d769da4d61dd7dc7f0b149b4</w:t>
       </w:r>
     </w:p>
     <w:p>
@@ -132,7 +132,7 @@
         <w:t xml:space="preserve"> </w:t>
       </w:r>
       <w:r>
-        <w:t xml:space="preserve">2026-09-28 20:17:17 -0700</w:t>
+        <w:t xml:space="preserve">2026-09-28 22:56:21 -0700</w:t>
       </w:r>
     </w:p>
     <w:p>

</xml_diff>

<commit_message>
Deploying to gh-pages from @ Morrison-Lab/psw@ae733b6d72083bed11851b4dd7aa21fd366a32f1 🚀
</commit_message>
<xml_diff>
--- a/references.docx
+++ b/references.docx
@@ -15,7 +15,7 @@
         <w:pStyle w:val="Date"/>
       </w:pPr>
       <w:r>
-        <w:t xml:space="preserve">Last modified: 2026-09-29 05:56:32 (UTC)</w:t>
+        <w:t xml:space="preserve">Last modified: 2026-10-02 01:10:21 (UTC)</w:t>
       </w:r>
     </w:p>
     <w:bookmarkStart w:id="10" w:name="references"/>
@@ -88,7 +88,7 @@
         <w:t xml:space="preserve"> </w:t>
       </w:r>
       <w:r>
-        <w:t xml:space="preserve">0669706</w:t>
+        <w:t xml:space="preserve">ae733b6</w:t>
       </w:r>
     </w:p>
     <w:p>
@@ -110,7 +110,7 @@
         <w:t xml:space="preserve"> </w:t>
       </w:r>
       <w:r>
-        <w:t xml:space="preserve">0669706494575783d769da4d61dd7dc7f0b149b4</w:t>
+        <w:t xml:space="preserve">ae733b6d72083bed11851b4dd7aa21fd366a32f1</w:t>
       </w:r>
     </w:p>
     <w:p>
@@ -132,7 +132,7 @@
         <w:t xml:space="preserve"> </w:t>
       </w:r>
       <w:r>
-        <w:t xml:space="preserve">2026-09-28 22:56:21 -0700</w:t>
+        <w:t xml:space="preserve">2026-10-01 18:10:09 -0700</w:t>
       </w:r>
     </w:p>
     <w:p>

</xml_diff>

<commit_message>
Deploying to gh-pages from @ Morrison-Lab/psw@b57af1ea03a055011656075a706034797bfea5a5 🚀
</commit_message>
<xml_diff>
--- a/references.docx
+++ b/references.docx
@@ -15,7 +15,7 @@
         <w:pStyle w:val="Date"/>
       </w:pPr>
       <w:r>
-        <w:t xml:space="preserve">Last modified: 2026-10-02 08:28:14 (UTC)</w:t>
+        <w:t xml:space="preserve">Last modified: 2026-10-02 08:36:57 (UTC)</w:t>
       </w:r>
     </w:p>
     <w:bookmarkStart w:id="10" w:name="references"/>
@@ -88,7 +88,7 @@
         <w:t xml:space="preserve"> </w:t>
       </w:r>
       <w:r>
-        <w:t xml:space="preserve">c6258c7</w:t>
+        <w:t xml:space="preserve">b57af1e</w:t>
       </w:r>
     </w:p>
     <w:p>
@@ -110,7 +110,7 @@
         <w:t xml:space="preserve"> </w:t>
       </w:r>
       <w:r>
-        <w:t xml:space="preserve">c6258c7076c45d402153c4e331be4a277276916a</w:t>
+        <w:t xml:space="preserve">b57af1ea03a055011656075a706034797bfea5a5</w:t>
       </w:r>
     </w:p>
     <w:p>
@@ -132,7 +132,7 @@
         <w:t xml:space="preserve"> </w:t>
       </w:r>
       <w:r>
-        <w:t xml:space="preserve">2026-10-02 01:27:59 -0700</w:t>
+        <w:t xml:space="preserve">2026-10-02 01:36:44 -0700</w:t>
       </w:r>
     </w:p>
     <w:p>

</xml_diff>

<commit_message>
Deploying to gh-pages from @ Morrison-Lab/psw@1ca239b265617b725ad88efbdec7dfd5825d1da3 🚀
</commit_message>
<xml_diff>
--- a/references.docx
+++ b/references.docx
@@ -15,7 +15,7 @@
         <w:pStyle w:val="Date"/>
       </w:pPr>
       <w:r>
-        <w:t xml:space="preserve">Last modified: 2026-10-02 10:17:46 (UTC)</w:t>
+        <w:t xml:space="preserve">Last modified: 2026-10-02 17:01:49 (UTC)</w:t>
       </w:r>
     </w:p>
     <w:bookmarkStart w:id="10" w:name="references"/>
@@ -88,7 +88,7 @@
         <w:t xml:space="preserve"> </w:t>
       </w:r>
       <w:r>
-        <w:t xml:space="preserve">5823bc8</w:t>
+        <w:t xml:space="preserve">1ca239b</w:t>
       </w:r>
     </w:p>
     <w:p>
@@ -110,7 +110,7 @@
         <w:t xml:space="preserve"> </w:t>
       </w:r>
       <w:r>
-        <w:t xml:space="preserve">5823bc80ff22ba1868aed3bda797dc8a7f75171f</w:t>
+        <w:t xml:space="preserve">1ca239b265617b725ad88efbdec7dfd5825d1da3</w:t>
       </w:r>
     </w:p>
     <w:p>
@@ -132,7 +132,7 @@
         <w:t xml:space="preserve"> </w:t>
       </w:r>
       <w:r>
-        <w:t xml:space="preserve">2026-10-02 03:17:23 -0700</w:t>
+        <w:t xml:space="preserve">2026-10-02 10:01:36 -0700</w:t>
       </w:r>
     </w:p>
     <w:p>

</xml_diff>

<commit_message>
Deploying to gh-pages from @ Morrison-Lab/psw@324a1310a0495c50f19937d3c96a734ccd8572d6 🚀
</commit_message>
<xml_diff>
--- a/references.docx
+++ b/references.docx
@@ -15,7 +15,7 @@
         <w:pStyle w:val="Date"/>
       </w:pPr>
       <w:r>
-        <w:t xml:space="preserve">Last modified: 2026-10-05 09:45:39 (UTC)</w:t>
+        <w:t xml:space="preserve">Last modified: 2026-10-05 10:08:24 (UTC)</w:t>
       </w:r>
     </w:p>
     <w:bookmarkStart w:id="10" w:name="references"/>
@@ -88,7 +88,7 @@
         <w:t xml:space="preserve"> </w:t>
       </w:r>
       <w:r>
-        <w:t xml:space="preserve">eed70e9</w:t>
+        <w:t xml:space="preserve">324a131</w:t>
       </w:r>
     </w:p>
     <w:p>
@@ -110,7 +110,7 @@
         <w:t xml:space="preserve"> </w:t>
       </w:r>
       <w:r>
-        <w:t xml:space="preserve">eed70e94929bc1933a000ba5880b57c9137f5264</w:t>
+        <w:t xml:space="preserve">324a1310a0495c50f19937d3c96a734ccd8572d6</w:t>
       </w:r>
     </w:p>
     <w:p>
@@ -132,7 +132,7 @@
         <w:t xml:space="preserve"> </w:t>
       </w:r>
       <w:r>
-        <w:t xml:space="preserve">2026-10-05 02:45:25 -0700</w:t>
+        <w:t xml:space="preserve">2026-10-05 03:08:10 -0700</w:t>
       </w:r>
     </w:p>
     <w:p>

</xml_diff>

<commit_message>
Deploying to gh-pages from @ Morrison-Lab/psw@e2d2c28738d508e6db64877f95a6efc654b464b9 🚀
</commit_message>
<xml_diff>
--- a/references.docx
+++ b/references.docx
@@ -15,7 +15,7 @@
         <w:pStyle w:val="Date"/>
       </w:pPr>
       <w:r>
-        <w:t xml:space="preserve">Last modified: 2026-10-05 10:34:59 (UTC)</w:t>
+        <w:t xml:space="preserve">Last modified: 2026-10-05 10:57:24 (UTC)</w:t>
       </w:r>
     </w:p>
     <w:bookmarkStart w:id="10" w:name="references"/>
@@ -88,7 +88,7 @@
         <w:t xml:space="preserve"> </w:t>
       </w:r>
       <w:r>
-        <w:t xml:space="preserve">4722d03</w:t>
+        <w:t xml:space="preserve">e2d2c28</w:t>
       </w:r>
     </w:p>
     <w:p>
@@ -110,7 +110,7 @@
         <w:t xml:space="preserve"> </w:t>
       </w:r>
       <w:r>
-        <w:t xml:space="preserve">4722d03e20b2ab4161859a37cd0d4490195ceeba</w:t>
+        <w:t xml:space="preserve">e2d2c28738d508e6db64877f95a6efc654b464b9</w:t>
       </w:r>
     </w:p>
     <w:p>
@@ -132,7 +132,7 @@
         <w:t xml:space="preserve"> </w:t>
       </w:r>
       <w:r>
-        <w:t xml:space="preserve">2026-10-05 03:34:45 -0700</w:t>
+        <w:t xml:space="preserve">2026-10-05 03:57:11 -0700</w:t>
       </w:r>
     </w:p>
     <w:p>

</xml_diff>

<commit_message>
Deploying to gh-pages from @ Morrison-Lab/psw@b61ba0bcc5929c5390456909517ad9b31f4d0738 🚀
</commit_message>
<xml_diff>
--- a/references.docx
+++ b/references.docx
@@ -15,7 +15,7 @@
         <w:pStyle w:val="Date"/>
       </w:pPr>
       <w:r>
-        <w:t xml:space="preserve">Last modified: 2026-10-05 10:57:24 (UTC)</w:t>
+        <w:t xml:space="preserve">Last modified: 2026-10-05 17:30:35 (UTC)</w:t>
       </w:r>
     </w:p>
     <w:bookmarkStart w:id="10" w:name="references"/>
@@ -88,7 +88,7 @@
         <w:t xml:space="preserve"> </w:t>
       </w:r>
       <w:r>
-        <w:t xml:space="preserve">e2d2c28</w:t>
+        <w:t xml:space="preserve">b61ba0b</w:t>
       </w:r>
     </w:p>
     <w:p>
@@ -110,7 +110,7 @@
         <w:t xml:space="preserve"> </w:t>
       </w:r>
       <w:r>
-        <w:t xml:space="preserve">e2d2c28738d508e6db64877f95a6efc654b464b9</w:t>
+        <w:t xml:space="preserve">b61ba0bcc5929c5390456909517ad9b31f4d0738</w:t>
       </w:r>
     </w:p>
     <w:p>
@@ -132,7 +132,7 @@
         <w:t xml:space="preserve"> </w:t>
       </w:r>
       <w:r>
-        <w:t xml:space="preserve">2026-10-05 03:57:11 -0700</w:t>
+        <w:t xml:space="preserve">2026-10-05 10:30:22 -0700</w:t>
       </w:r>
     </w:p>
     <w:p>

</xml_diff>

<commit_message>
Deploying to gh-pages from @ Morrison-Lab/psw@5872586d2778227f73bb2fe2749f78296aaad81b 🚀
</commit_message>
<xml_diff>
--- a/references.docx
+++ b/references.docx
@@ -15,7 +15,7 @@
         <w:pStyle w:val="Date"/>
       </w:pPr>
       <w:r>
-        <w:t xml:space="preserve">Last modified: 2026-10-08 22:39:48 (UTC)</w:t>
+        <w:t xml:space="preserve">Last modified: 2026-10-08 23:04:55 (UTC)</w:t>
       </w:r>
     </w:p>
     <w:bookmarkStart w:id="10" w:name="references"/>
@@ -88,7 +88,7 @@
         <w:t xml:space="preserve"> </w:t>
       </w:r>
       <w:r>
-        <w:t xml:space="preserve">226ceca</w:t>
+        <w:t xml:space="preserve">5872586</w:t>
       </w:r>
     </w:p>
     <w:p>
@@ -110,7 +110,7 @@
         <w:t xml:space="preserve"> </w:t>
       </w:r>
       <w:r>
-        <w:t xml:space="preserve">226ceca4089fb9b7343d39e5f9b8382f5a9875fc</w:t>
+        <w:t xml:space="preserve">5872586d2778227f73bb2fe2749f78296aaad81b</w:t>
       </w:r>
     </w:p>
     <w:p>
@@ -132,7 +132,7 @@
         <w:t xml:space="preserve"> </w:t>
       </w:r>
       <w:r>
-        <w:t xml:space="preserve">2026-10-08 15:39:36 -0700</w:t>
+        <w:t xml:space="preserve">2026-10-08 23:04:45 +0000</w:t>
       </w:r>
     </w:p>
     <w:p>

</xml_diff>